<commit_message>
Kein Epochen-Kurzname oder -Ort als Krippe: W1-L3-02, Akte W1·3 Auftrag 3, Akte W0·1 Auftrag 5 mit eigenen Klartexten; Test K8 erweitert
- K8: Kurznamen und Orte der Epochen (Bagdad, Sparta, Rom …) zählen als Krippe, Stoppliste für „heute“ u. Ä.
- W1-L3-02 `3947H OWTOQ HQ005 862DK 90` → der kalif erwartet die karawane in basra; Akte W1·3 A3
  `39470 0PSBD SGQPD HUHKQ ORBHK` → der kalif schickt sieben truhen; Akte W0·1 A5 `DINII HFIDE TECFS BRSEE`
  (Gartenzaun n = 4) → die schiffe sind bereit
- Specs, Prüfwerte, Bibliothekstests (JS, Python-Zwilling), D15 nachgezogen; Akten W0·1 und W1·3 neu gebaut samt PDFs

Co-Authored-By: Claude Opus 5.5 <noreply@anthropic.com>
Claude-Session: https://claude.ai/code/session_01JKXVQqFeKVmyQ9jfHw4db3
</commit_message>
<xml_diff>
--- a/materialien/Welt0_Antike/5_Loesungen/KR_W0_Akte1_Skytale_von_Sparta_LSG.docx
+++ b/materialien/Welt0_Antike/5_Loesungen/KR_W0_Akte1_Skytale_von_Sparta_LSG.docx
@@ -7048,7 +7048,7 @@
                 <w:spacing w:val="24"/>
                 <w:sz w:val="23"/>
               </w:rPr>
-              <w:t>SSFDP ASFED AATCI SNRHI</w:t>
+              <w:t>DINII HFIDE TECFS BRSEE</w:t>
             </w:r>
           </w:p>
         </w:tc>
@@ -7150,7 +7150,7 @@
                 <w:color w:val="1F4E8C"/>
                 <w:sz w:val="22"/>
               </w:rPr>
-              <w:t>SSFD</w:t>
+              <w:t>DINI</w:t>
             </w:r>
             <w:r>
               <w:rPr>
@@ -7170,7 +7170,7 @@
                 <w:color w:val="1F4E8C"/>
                 <w:sz w:val="22"/>
               </w:rPr>
-              <w:t>PASFEDA</w:t>
+              <w:t>IHFIDET</w:t>
             </w:r>
             <w:r>
               <w:rPr>
@@ -7190,7 +7190,7 @@
                 <w:color w:val="1F4E8C"/>
                 <w:sz w:val="22"/>
               </w:rPr>
-              <w:t>ATCISN</w:t>
+              <w:t>ECFSBR</w:t>
             </w:r>
             <w:r>
               <w:rPr>
@@ -7210,7 +7210,7 @@
                 <w:color w:val="1F4E8C"/>
                 <w:sz w:val="22"/>
               </w:rPr>
-              <w:t>RHI</w:t>
+              <w:t>SEE</w:t>
             </w:r>
             <w:r>
               <w:rPr>
@@ -7230,7 +7230,7 @@
                 <w:color w:val="1F4E8C"/>
                 <w:sz w:val="22"/>
               </w:rPr>
-              <w:t>„spartas schiffe sind da“</w:t>
+              <w:t>„die schiffe sind bereit“</w:t>
             </w:r>
             <w:r>
               <w:rPr>

</xml_diff>